<commit_message>
docs: ajusta relatorio tecnico final
</commit_message>
<xml_diff>
--- a/docs/RELATÓRIO TÉCNICO.docx
+++ b/docs/RELATÓRIO TÉCNICO.docx
@@ -1,6 +1,6 @@
 
 <file path=word/document.xml><?xml version="1.0" encoding="utf-8"?>
-<w:document xmlns:ns1="http://schemas.openxmlformats.org/markup-compatibility/2006" xmlns:w="http://schemas.openxmlformats.org/wordprocessingml/2006/main" ns1:Ignorable="w14 w15 wp14 w16se w16cid w16 w16cex w16sdtdh w16sdtfl">
+<w:document xmlns:mc="http://schemas.openxmlformats.org/markup-compatibility/2006" xmlns:w="http://schemas.openxmlformats.org/wordprocessingml/2006/main" xmlns:w14="http://schemas.microsoft.com/office/word/2010/wordml" xmlns:w15="http://schemas.microsoft.com/office/word/2012/wordml" xmlns:wp14="http://schemas.microsoft.com/office/word/2010/wordprocessingDrawing" xmlns:w16se="http://schemas.microsoft.com/office/word/2015/wordml/symex" xmlns:w16cid="http://schemas.microsoft.com/office/word/2016/wordml/cid" xmlns:w16="http://schemas.microsoft.com/office/word/2018/wordml" xmlns:w16cex="http://schemas.microsoft.com/office/word/2018/wordml/cex" xmlns:w16sdtdh="http://schemas.microsoft.com/office/word/2020/wordml/sdtdatahash" xmlns:w16sdtfl="http://schemas.microsoft.com/office/word/2024/wordml/sdtformatlock" mc:Ignorable="w14 w15 wp14 w16se w16cid w16 w16cex w16sdtdh w16sdtfl">
   <w:body>
     <w:p>
       <w:r>
@@ -280,6 +280,11 @@
     <w:p>
       <w:r>
         <w:t>A cobertura foi medida com JaCoCo. No estado final do projeto, a cobertura monitorada ficou em 95,17% no escopo definido pela configuração do build, acima da meta mínima estabelecida. A suíte automatizada totaliza 58 testes aprovados. A regra de cobertura exclui DTOs, entidades, enums, classes de configuração e a classe principal, concentrando a métrica nas camadas com lógica de negócio e orquestração.</w:t>
+      </w:r>
+    </w:p>
+    <w:p>
+      <w:r>
+        <w:t xml:space="preserve">12. Considerações Técnicas Finais</w:t>
       </w:r>
     </w:p>
     <w:p>

</xml_diff>

<commit_message>
docs: adiciona identificacao academica na entrega
</commit_message>
<xml_diff>
--- a/docs/RELATÓRIO TÉCNICO.docx
+++ b/docs/RELATÓRIO TÉCNICO.docx
@@ -5,6 +5,26 @@
     <w:p>
       <w:r>
         <w:t xml:space="preserve">RELATÓRIO TÉCNICO — TECH CHALLENGE FASE 2</w:t>
+      </w:r>
+    </w:p>
+    <w:p>
+      <w:r>
+        <w:t>Paulo Vinicius de Souza Martinez</w:t>
+      </w:r>
+    </w:p>
+    <w:p>
+      <w:r>
+        <w:t>RM360057</w:t>
+      </w:r>
+    </w:p>
+    <w:p>
+      <w:r>
+        <w:t>Repositório GitHub:</w:t>
+      </w:r>
+    </w:p>
+    <w:p>
+      <w:r>
+        <w:t>https://github.com/PauloVinic/biblioteca-api</w:t>
       </w:r>
     </w:p>
     <w:p>

</xml_diff>